<commit_message>
release 1.8.1: fix flexão indevida de adjetivo e disjunção genérica de 4 vias
- não flexiona papel usado como adjetivo/composto ("saldo devedor" deixava de
  virar "saldo devedores" com réu no plural); só flexiona o núcleo nominal
- resolve disjunções de concordância de 4 vias fora do vocabulário fixo
  ("(qualificado ou qualificados ou qualificada ou qualificadas)" -> concorda
  com o réu) em flexao.py
- testes cobrindo ambos os casos
- inclui edições pendentes de 4 templates .docx

Co-Authored-By: Claude Opus 4.8 (1M context) <noreply@anthropic.com>
</commit_message>
<xml_diff>
--- a/Petições/Penhora/Penhora de cotas.docx
+++ b/Petições/Penhora/Penhora de cotas.docx
@@ -543,45 +543,54 @@
       <w:r>
         <w:rPr>
           <w:rFonts w:ascii="Calibri" w:hAnsi="Calibri" w:cs="Calibri"/>
-          <w:sz w:val="24"/>
-          <w:szCs w:val="22"/>
-          <w:highlight w:val="yellow"/>
-        </w:rPr>
-        <w:t>(do ou dos</w:t>
-      </w:r>
-      <w:r>
-        <w:rPr>
-          <w:rFonts w:ascii="Calibri" w:hAnsi="Calibri" w:cs="Calibri"/>
-          <w:sz w:val="24"/>
-          <w:szCs w:val="22"/>
-          <w:highlight w:val="yellow"/>
-        </w:rPr>
-        <w:t xml:space="preserve"> ou da ou das</w:t>
-      </w:r>
-      <w:r>
-        <w:rPr>
-          <w:rFonts w:ascii="Calibri" w:hAnsi="Calibri" w:cs="Calibri"/>
-          <w:sz w:val="24"/>
-          <w:szCs w:val="22"/>
-          <w:highlight w:val="yellow"/>
-        </w:rPr>
-        <w:t>) (executado ou executados</w:t>
-      </w:r>
-      <w:r>
-        <w:rPr>
-          <w:rFonts w:ascii="Calibri" w:hAnsi="Calibri" w:cs="Calibri"/>
-          <w:sz w:val="24"/>
-          <w:szCs w:val="22"/>
-          <w:highlight w:val="yellow"/>
-        </w:rPr>
-        <w:t xml:space="preserve"> ou executada ou executadas</w:t>
-      </w:r>
-      <w:r>
-        <w:rPr>
-          <w:rFonts w:ascii="Calibri" w:hAnsi="Calibri" w:cs="Calibri"/>
-          <w:sz w:val="24"/>
-          <w:szCs w:val="22"/>
-          <w:highlight w:val="yellow"/>
+          <w:color w:val="FF0000"/>
+          <w:sz w:val="24"/>
+          <w:szCs w:val="22"/>
+        </w:rPr>
+        <w:t>do(</w:t>
+      </w:r>
+      <w:r>
+        <w:rPr>
+          <w:rFonts w:ascii="Calibri" w:hAnsi="Calibri" w:cs="Calibri"/>
+          <w:color w:val="FF0000"/>
+          <w:sz w:val="24"/>
+          <w:szCs w:val="22"/>
+        </w:rPr>
+        <w:t>a</w:t>
+      </w:r>
+      <w:r>
+        <w:rPr>
+          <w:rFonts w:ascii="Calibri" w:hAnsi="Calibri" w:cs="Calibri"/>
+          <w:color w:val="FF0000"/>
+          <w:sz w:val="24"/>
+          <w:szCs w:val="22"/>
+        </w:rPr>
+        <w:t>)(s)</w:t>
+      </w:r>
+      <w:r>
+        <w:rPr>
+          <w:rFonts w:ascii="Calibri" w:hAnsi="Calibri" w:cs="Calibri"/>
+          <w:color w:val="FF0000"/>
+          <w:sz w:val="24"/>
+          <w:szCs w:val="22"/>
+        </w:rPr>
+        <w:t xml:space="preserve"> </w:t>
+      </w:r>
+      <w:r>
+        <w:rPr>
+          <w:rFonts w:ascii="Calibri" w:hAnsi="Calibri" w:cs="Calibri"/>
+          <w:color w:val="FF0000"/>
+          <w:sz w:val="24"/>
+          <w:szCs w:val="22"/>
+        </w:rPr>
+        <w:t>executado(a)(s</w:t>
+      </w:r>
+      <w:r>
+        <w:rPr>
+          <w:rFonts w:ascii="Calibri" w:hAnsi="Calibri" w:cs="Calibri"/>
+          <w:color w:val="FF0000"/>
+          <w:sz w:val="24"/>
+          <w:szCs w:val="22"/>
         </w:rPr>
         <w:t>)</w:t>
       </w:r>
@@ -591,7 +600,15 @@
           <w:sz w:val="24"/>
           <w:szCs w:val="22"/>
         </w:rPr>
-        <w:t xml:space="preserve">, sendo a própria decisão válida como ofício, fazendo-se constar especificamente a razão social e CNPJ </w:t>
+        <w:t>,</w:t>
+      </w:r>
+      <w:r>
+        <w:rPr>
+          <w:rFonts w:ascii="Calibri" w:hAnsi="Calibri" w:cs="Calibri"/>
+          <w:sz w:val="24"/>
+          <w:szCs w:val="22"/>
+        </w:rPr>
+        <w:t xml:space="preserve"> sendo a própria decisão válida como ofício, fazendo-se constar especificamente a razão social e CNPJ </w:t>
       </w:r>
       <w:r>
         <w:rPr>
@@ -945,7 +962,7 @@
           <w:sz w:val="24"/>
           <w:szCs w:val="22"/>
         </w:rPr>
-        <w:t>22 de julho de 2026</w:t>
+        <w:t>28 de julho de 2026</w:t>
       </w:r>
       <w:r>
         <w:rPr>
@@ -1121,7 +1138,7 @@
         <w:sz w:val="20"/>
         <w:szCs w:val="20"/>
       </w:rPr>
-      <w:t>2</w:t>
+      <w:t>1</w:t>
     </w:r>
     <w:r>
       <w:rPr>
@@ -1170,7 +1187,7 @@
         <w:sz w:val="20"/>
         <w:szCs w:val="20"/>
       </w:rPr>
-      <w:t>2</w:t>
+      <w:t>1</w:t>
     </w:r>
     <w:r>
       <w:rPr>

</xml_diff>